<commit_message>
Lebenslauf update und typos ausgebessert
</commit_message>
<xml_diff>
--- a/cv_toechterle.docx
+++ b/cv_toechterle.docx
@@ -2,41 +2,6 @@
 <file path=word/document.xml><?xml version="1.0" encoding="utf-8"?>
 <w:document xmlns:wpc="http://schemas.microsoft.com/office/word/2010/wordprocessingCanvas" xmlns:cx="http://schemas.microsoft.com/office/drawing/2014/chartex" xmlns:cx1="http://schemas.microsoft.com/office/drawing/2015/9/8/chartex" xmlns:cx2="http://schemas.microsoft.com/office/drawing/2015/10/21/chartex" xmlns:cx3="http://schemas.microsoft.com/office/drawing/2016/5/9/chartex" xmlns:cx4="http://schemas.microsoft.com/office/drawing/2016/5/10/chartex" xmlns:cx5="http://schemas.microsoft.com/office/drawing/2016/5/11/chartex" xmlns:cx6="http://schemas.microsoft.com/office/drawing/2016/5/12/chartex" xmlns:cx7="http://schemas.microsoft.com/office/drawing/2016/5/13/chartex" xmlns:cx8="http://schemas.microsoft.com/office/drawing/2016/5/14/chartex" xmlns:mc="http://schemas.openxmlformats.org/markup-compatibility/2006" xmlns:aink="http://schemas.microsoft.com/office/drawing/2016/ink" xmlns:am3d="http://schemas.microsoft.com/office/drawing/2017/model3d" xmlns:o="urn:schemas-microsoft-com:office:office" xmlns:oel="http://schemas.microsoft.com/office/2019/extlst" xmlns:r="http://schemas.openxmlformats.org/officeDocument/2006/relationships" xmlns:m="http://schemas.openxmlformats.org/officeDocument/2006/math" xmlns:v="urn:schemas-microsoft-com:vml" xmlns:wp14="http://schemas.microsoft.com/office/word/2010/wordprocessingDrawing" xmlns:wp="http://schemas.openxmlformats.org/drawingml/2006/wordprocessingDrawing" xmlns:w10="urn:schemas-microsoft-com:office:word" xmlns:w="http://schemas.openxmlformats.org/wordprocessingml/2006/main" xmlns:w14="http://schemas.microsoft.com/office/word/2010/wordml" xmlns:w15="http://schemas.microsoft.com/office/word/2012/wordml" xmlns:w16cex="http://schemas.microsoft.com/office/word/2018/wordml/cex" xmlns:w16cid="http://schemas.microsoft.com/office/word/2016/wordml/cid" xmlns:w16="http://schemas.microsoft.com/office/word/2018/wordml" xmlns:w16du="http://schemas.microsoft.com/office/word/2023/wordml/word16du" xmlns:w16sdtdh="http://schemas.microsoft.com/office/word/2020/wordml/sdtdatahash" xmlns:w16sdtfl="http://schemas.microsoft.com/office/word/2024/wordml/sdtformatlock" xmlns:w16se="http://schemas.microsoft.com/office/word/2015/wordml/symex" xmlns:wpg="http://schemas.microsoft.com/office/word/2010/wordprocessingGroup" xmlns:wpi="http://schemas.microsoft.com/office/word/2010/wordprocessingInk" xmlns:wne="http://schemas.microsoft.com/office/word/2006/wordml" xmlns:wps="http://schemas.microsoft.com/office/word/2010/wordprocessingShape" mc:Ignorable="w14 w15 w16se w16cid w16 w16cex w16sdtdh w16sdtfl w16du wp14">
   <w:body>
-    <w:p>
-      <w:pPr>
-        <w:spacing w:after="30"/>
-      </w:pPr>
-      <w:r>
-        <w:rPr>
-          <w:b/>
-          <w:bCs/>
-          <w:color w:val="3A9971"/>
-          <w:sz w:val="18"/>
-          <w:szCs w:val="18"/>
-        </w:rPr>
-        <w:t>Geologe &amp; Energie</w:t>
-      </w:r>
-      <w:r>
-        <w:rPr>
-          <w:b/>
-          <w:bCs/>
-          <w:color w:val="3A9971"/>
-          <w:sz w:val="18"/>
-          <w:szCs w:val="18"/>
-        </w:rPr>
-        <w:t>-E</w:t>
-      </w:r>
-      <w:r>
-        <w:rPr>
-          <w:b/>
-          <w:bCs/>
-          <w:color w:val="3A9971"/>
-          <w:sz w:val="18"/>
-          <w:szCs w:val="18"/>
-        </w:rPr>
-        <w:t>xperte</w:t>
-      </w:r>
-    </w:p>
     <w:p>
       <w:pPr>
         <w:spacing w:after="60"/>
@@ -113,23 +78,7 @@
             <w:sz w:val="18"/>
             <w:szCs w:val="18"/>
           </w:rPr>
-          <w:t>paulto</w:t>
-        </w:r>
-        <w:r>
-          <w:rPr>
-            <w:rStyle w:val="Hyperlink"/>
-            <w:sz w:val="18"/>
-            <w:szCs w:val="18"/>
-          </w:rPr>
-          <w:t>e</w:t>
-        </w:r>
-        <w:r>
-          <w:rPr>
-            <w:rStyle w:val="Hyperlink"/>
-            <w:sz w:val="18"/>
-            <w:szCs w:val="18"/>
-          </w:rPr>
-          <w:t>chterle.</w:t>
+          <w:t>paultoechterle.</w:t>
         </w:r>
         <w:r>
           <w:rPr>
@@ -140,6 +89,25 @@
           <w:t>at</w:t>
         </w:r>
       </w:hyperlink>
+      <w:r>
+        <w:t xml:space="preserve"> </w:t>
+      </w:r>
+      <w:r>
+        <w:rPr>
+          <w:color w:val="607080"/>
+          <w:sz w:val="18"/>
+          <w:szCs w:val="18"/>
+        </w:rPr>
+        <w:t xml:space="preserve"> ·  </w:t>
+      </w:r>
+      <w:r>
+        <w:rPr>
+          <w:color w:val="607080"/>
+          <w:sz w:val="18"/>
+          <w:szCs w:val="18"/>
+        </w:rPr>
+        <w:t>+43 650 571 40 68</w:t>
+      </w:r>
     </w:p>
     <w:p>
       <w:pPr>
@@ -521,7 +489,7 @@
                 <w:sz w:val="19"/>
                 <w:szCs w:val="19"/>
               </w:rPr>
-              <w:t>Wasserkraft</w:t>
+              <w:t>Permafrost</w:t>
             </w:r>
           </w:p>
         </w:tc>
@@ -695,7 +663,7 @@
                 <w:sz w:val="19"/>
                 <w:szCs w:val="19"/>
               </w:rPr>
-              <w:t>Energieraumplanung</w:t>
+              <w:t>Klimawandel</w:t>
             </w:r>
           </w:p>
         </w:tc>
@@ -813,11 +781,14 @@
     </w:p>
     <w:p>
       <w:pPr>
-        <w:pBdr>
-          <w:left w:val="single" w:sz="12" w:space="8" w:color="2E7D5E"/>
-        </w:pBdr>
-        <w:spacing w:before="80" w:after="20"/>
         <w:ind w:left="200"/>
+        <w:rPr>
+          <w:b/>
+          <w:bCs/>
+          <w:color w:val="2E7D5E"/>
+          <w:sz w:val="17"/>
+          <w:szCs w:val="17"/>
+        </w:rPr>
       </w:pPr>
       <w:r>
         <w:rPr>
@@ -826,6 +797,99 @@
           <w:color w:val="1E2D3D"/>
         </w:rPr>
         <w:t>Großquellenhydrogeologie Tirol</w:t>
+      </w:r>
+      <w:r>
+        <w:rPr>
+          <w:b/>
+          <w:bCs/>
+          <w:color w:val="1E2D3D"/>
+        </w:rPr>
+        <w:t xml:space="preserve"> </w:t>
+      </w:r>
+      <w:proofErr w:type="gramStart"/>
+      <w:r>
+        <w:rPr>
+          <w:b/>
+          <w:bCs/>
+          <w:color w:val="2E7D5E"/>
+          <w:sz w:val="17"/>
+          <w:szCs w:val="17"/>
+        </w:rPr>
+        <w:t>Hydrogeologie</w:t>
+      </w:r>
+      <w:r>
+        <w:rPr>
+          <w:color w:val="607080"/>
+          <w:sz w:val="17"/>
+          <w:szCs w:val="17"/>
+        </w:rPr>
+        <w:t xml:space="preserve">  ·</w:t>
+      </w:r>
+      <w:proofErr w:type="gramEnd"/>
+      <w:r>
+        <w:rPr>
+          <w:color w:val="607080"/>
+          <w:sz w:val="17"/>
+          <w:szCs w:val="17"/>
+        </w:rPr>
+        <w:t xml:space="preserve">  </w:t>
+      </w:r>
+      <w:proofErr w:type="gramStart"/>
+      <w:r>
+        <w:rPr>
+          <w:b/>
+          <w:bCs/>
+          <w:color w:val="2E7D5E"/>
+          <w:sz w:val="17"/>
+          <w:szCs w:val="17"/>
+        </w:rPr>
+        <w:t>Datenmanagement</w:t>
+      </w:r>
+      <w:r>
+        <w:rPr>
+          <w:color w:val="607080"/>
+          <w:sz w:val="17"/>
+          <w:szCs w:val="17"/>
+        </w:rPr>
+        <w:t xml:space="preserve">  ·</w:t>
+      </w:r>
+      <w:proofErr w:type="gramEnd"/>
+      <w:r>
+        <w:rPr>
+          <w:color w:val="607080"/>
+          <w:sz w:val="17"/>
+          <w:szCs w:val="17"/>
+        </w:rPr>
+        <w:t xml:space="preserve">  </w:t>
+      </w:r>
+      <w:r>
+        <w:rPr>
+          <w:b/>
+          <w:bCs/>
+          <w:color w:val="2E7D5E"/>
+          <w:sz w:val="17"/>
+          <w:szCs w:val="17"/>
+        </w:rPr>
+        <w:t>GIS</w:t>
+      </w:r>
+    </w:p>
+    <w:p>
+      <w:pPr>
+        <w:spacing w:after="20"/>
+        <w:ind w:left="200"/>
+        <w:rPr>
+          <w:color w:val="4A5A6A"/>
+          <w:sz w:val="19"/>
+          <w:szCs w:val="19"/>
+        </w:rPr>
+      </w:pPr>
+      <w:r>
+        <w:rPr>
+          <w:color w:val="4A5A6A"/>
+          <w:sz w:val="19"/>
+          <w:szCs w:val="19"/>
+        </w:rPr>
+        <w:t>Geländeaufnahme, hydrogeologische Analyse und wasserwirtschaftliche Beurteilung der 93 Tiroler Großquellen zur strategischen Trinkwasserversorgung im Auftrag der Tiroler Landesregierung.</w:t>
       </w:r>
     </w:p>
     <w:p>
@@ -833,18 +897,29 @@
         <w:spacing w:after="20"/>
         <w:ind w:left="200"/>
       </w:pPr>
-      <w:r>
-        <w:rPr>
-          <w:color w:val="4A5A6A"/>
-          <w:sz w:val="19"/>
-          <w:szCs w:val="19"/>
-        </w:rPr>
-        <w:t>Geländeaufnahme, hydrogeologische Analyse und wasserwirtschaftliche Beurteilung der 93 Tiroler Großquellen zur strategischen Trinkwasserversorgung im Auftrag der Tiroler Landesregierung.</w:t>
-      </w:r>
     </w:p>
     <w:p>
       <w:pPr>
         <w:ind w:left="200"/>
+      </w:pPr>
+      <w:r>
+        <w:rPr>
+          <w:b/>
+          <w:bCs/>
+          <w:color w:val="1E2D3D"/>
+        </w:rPr>
+        <w:t>Trinkwasser-Bedarfsmodell Tirol</w:t>
+      </w:r>
+      <w:r>
+        <w:rPr>
+          <w:b/>
+          <w:bCs/>
+          <w:color w:val="1E2D3D"/>
+        </w:rPr>
+        <w:t xml:space="preserve"> </w:t>
+      </w:r>
+      <w:proofErr w:type="spellStart"/>
+      <w:r>
         <w:rPr>
           <w:b/>
           <w:bCs/>
@@ -852,8 +927,9 @@
           <w:sz w:val="17"/>
           <w:szCs w:val="17"/>
         </w:rPr>
-      </w:pPr>
-      <w:proofErr w:type="gramStart"/>
+        <w:t>Machine</w:t>
+      </w:r>
+      <w:proofErr w:type="spellEnd"/>
       <w:r>
         <w:rPr>
           <w:b/>
@@ -862,24 +938,7 @@
           <w:sz w:val="17"/>
           <w:szCs w:val="17"/>
         </w:rPr>
-        <w:t>Hydrogeologie</w:t>
-      </w:r>
-      <w:r>
-        <w:rPr>
-          <w:color w:val="607080"/>
-          <w:sz w:val="17"/>
-          <w:szCs w:val="17"/>
-        </w:rPr>
-        <w:t xml:space="preserve">  ·</w:t>
-      </w:r>
-      <w:proofErr w:type="gramEnd"/>
-      <w:r>
-        <w:rPr>
-          <w:color w:val="607080"/>
-          <w:sz w:val="17"/>
-          <w:szCs w:val="17"/>
-        </w:rPr>
-        <w:t xml:space="preserve">  </w:t>
+        <w:t xml:space="preserve"> </w:t>
       </w:r>
       <w:proofErr w:type="gramStart"/>
       <w:r>
@@ -890,7 +949,7 @@
           <w:sz w:val="17"/>
           <w:szCs w:val="17"/>
         </w:rPr>
-        <w:t>Datenmanagement</w:t>
+        <w:t>Learning</w:t>
       </w:r>
       <w:r>
         <w:rPr>
@@ -909,6 +968,7 @@
         </w:rPr>
         <w:t xml:space="preserve">  </w:t>
       </w:r>
+      <w:proofErr w:type="gramStart"/>
       <w:r>
         <w:rPr>
           <w:b/>
@@ -917,24 +977,71 @@
           <w:sz w:val="17"/>
           <w:szCs w:val="17"/>
         </w:rPr>
-        <w:t>GIS</w:t>
+        <w:t>Trinkwasserversorgung</w:t>
+      </w:r>
+      <w:r>
+        <w:rPr>
+          <w:color w:val="607080"/>
+          <w:sz w:val="17"/>
+          <w:szCs w:val="17"/>
+        </w:rPr>
+        <w:t xml:space="preserve">  ·</w:t>
+      </w:r>
+      <w:proofErr w:type="gramEnd"/>
+      <w:r>
+        <w:rPr>
+          <w:color w:val="607080"/>
+          <w:sz w:val="17"/>
+          <w:szCs w:val="17"/>
+        </w:rPr>
+        <w:t xml:space="preserve">  </w:t>
+      </w:r>
+      <w:r>
+        <w:rPr>
+          <w:b/>
+          <w:bCs/>
+          <w:color w:val="2E7D5E"/>
+          <w:sz w:val="17"/>
+          <w:szCs w:val="17"/>
+        </w:rPr>
+        <w:t>Datenmanagement</w:t>
       </w:r>
     </w:p>
     <w:p>
       <w:pPr>
-        <w:pBdr>
-          <w:left w:val="single" w:sz="12" w:space="8" w:color="2E7D5E"/>
-        </w:pBdr>
-        <w:spacing w:before="80" w:after="20"/>
+        <w:spacing w:after="20"/>
         <w:ind w:left="200"/>
+        <w:rPr>
+          <w:color w:val="4A5A6A"/>
+          <w:sz w:val="19"/>
+          <w:szCs w:val="19"/>
+        </w:rPr>
       </w:pPr>
       <w:r>
         <w:rPr>
-          <w:b/>
-          <w:bCs/>
-          <w:color w:val="1E2D3D"/>
-        </w:rPr>
-        <w:t>Trinkwasser-Bedarfsmodell Tirol</w:t>
+          <w:color w:val="4A5A6A"/>
+          <w:sz w:val="19"/>
+          <w:szCs w:val="19"/>
+        </w:rPr>
+        <w:t xml:space="preserve">Entwicklung </w:t>
+      </w:r>
+      <w:proofErr w:type="spellStart"/>
+      <w:r>
+        <w:rPr>
+          <w:color w:val="4A5A6A"/>
+          <w:sz w:val="19"/>
+          <w:szCs w:val="19"/>
+        </w:rPr>
+        <w:t>Machine</w:t>
+      </w:r>
+      <w:proofErr w:type="spellEnd"/>
+      <w:r>
+        <w:rPr>
+          <w:color w:val="4A5A6A"/>
+          <w:sz w:val="19"/>
+          <w:szCs w:val="19"/>
+        </w:rPr>
+        <w:t>-Learning basierten Bedarfsmodells im Rahmen des Trinkwasservorsorgekonzepts im Auftrag der Abteilung Wasserwirtschaft (Land Tirol). Das Modell prognostiziert den aktuellen und zukünftigen Pro-Kopf-Bedarf basierend auf statistischen und klimatischen Kennzahlen und Modellprognosen.</w:t>
       </w:r>
     </w:p>
     <w:p>
@@ -942,39 +1049,10 @@
         <w:spacing w:after="20"/>
         <w:ind w:left="200"/>
       </w:pPr>
-      <w:r>
-        <w:rPr>
-          <w:color w:val="4A5A6A"/>
-          <w:sz w:val="19"/>
-          <w:szCs w:val="19"/>
-        </w:rPr>
-        <w:t xml:space="preserve">Entwicklung </w:t>
-      </w:r>
-      <w:proofErr w:type="spellStart"/>
-      <w:r>
-        <w:rPr>
-          <w:color w:val="4A5A6A"/>
-          <w:sz w:val="19"/>
-          <w:szCs w:val="19"/>
-        </w:rPr>
-        <w:t>Machine</w:t>
-      </w:r>
-      <w:proofErr w:type="spellEnd"/>
-      <w:r>
-        <w:rPr>
-          <w:color w:val="4A5A6A"/>
-          <w:sz w:val="19"/>
-          <w:szCs w:val="19"/>
-        </w:rPr>
-        <w:t>-Learning basierten Bedarfsmodells im Rahmen des Trinkwasservorsorgekonzepts im Auftrag der Abteilung Wasserwirtschaft (Land Tirol). Das Modell prognostiziert den aktuellen und zukünftigen Pro-Kopf-Bedarf basierend auf statistischen und klimatischen Kennzahlen und Modellprognosen.</w:t>
-      </w:r>
     </w:p>
     <w:p>
       <w:pPr>
         <w:ind w:left="200"/>
-      </w:pPr>
-      <w:proofErr w:type="spellStart"/>
-      <w:r>
         <w:rPr>
           <w:b/>
           <w:bCs/>
@@ -982,9 +1060,24 @@
           <w:sz w:val="17"/>
           <w:szCs w:val="17"/>
         </w:rPr>
-        <w:t>Machine</w:t>
-      </w:r>
-      <w:proofErr w:type="spellEnd"/>
+      </w:pPr>
+      <w:r>
+        <w:rPr>
+          <w:b/>
+          <w:bCs/>
+          <w:color w:val="1E2D3D"/>
+        </w:rPr>
+        <w:t>Universelles Abflussmodell Tirol</w:t>
+      </w:r>
+      <w:r>
+        <w:rPr>
+          <w:b/>
+          <w:bCs/>
+          <w:color w:val="1E2D3D"/>
+        </w:rPr>
+        <w:t xml:space="preserve"> </w:t>
+      </w:r>
+      <w:proofErr w:type="spellStart"/>
       <w:r>
         <w:rPr>
           <w:b/>
@@ -993,9 +1086,9 @@
           <w:sz w:val="17"/>
           <w:szCs w:val="17"/>
         </w:rPr>
-        <w:t xml:space="preserve"> </w:t>
-      </w:r>
-      <w:proofErr w:type="gramStart"/>
+        <w:t>Machine</w:t>
+      </w:r>
+      <w:proofErr w:type="spellEnd"/>
       <w:r>
         <w:rPr>
           <w:b/>
@@ -1004,24 +1097,7 @@
           <w:sz w:val="17"/>
           <w:szCs w:val="17"/>
         </w:rPr>
-        <w:t>Learning</w:t>
-      </w:r>
-      <w:r>
-        <w:rPr>
-          <w:color w:val="607080"/>
-          <w:sz w:val="17"/>
-          <w:szCs w:val="17"/>
-        </w:rPr>
-        <w:t xml:space="preserve">  ·</w:t>
-      </w:r>
-      <w:proofErr w:type="gramEnd"/>
-      <w:r>
-        <w:rPr>
-          <w:color w:val="607080"/>
-          <w:sz w:val="17"/>
-          <w:szCs w:val="17"/>
-        </w:rPr>
-        <w:t xml:space="preserve">  </w:t>
+        <w:t xml:space="preserve"> </w:t>
       </w:r>
       <w:proofErr w:type="gramStart"/>
       <w:r>
@@ -1032,7 +1108,7 @@
           <w:sz w:val="17"/>
           <w:szCs w:val="17"/>
         </w:rPr>
-        <w:t>Trinkwasserversorgung</w:t>
+        <w:t>Learning</w:t>
       </w:r>
       <w:r>
         <w:rPr>
@@ -1040,17 +1116,26 @@
           <w:sz w:val="17"/>
           <w:szCs w:val="17"/>
         </w:rPr>
-        <w:t xml:space="preserve">  ·</w:t>
-      </w:r>
-      <w:proofErr w:type="gramEnd"/>
+        <w:t xml:space="preserve">  </w:t>
+      </w:r>
       <w:r>
         <w:rPr>
           <w:color w:val="607080"/>
           <w:sz w:val="17"/>
           <w:szCs w:val="17"/>
         </w:rPr>
+        <w:t>·</w:t>
+      </w:r>
+      <w:proofErr w:type="gramEnd"/>
+      <w:r>
+        <w:rPr>
+          <w:color w:val="607080"/>
+          <w:sz w:val="17"/>
+          <w:szCs w:val="17"/>
+        </w:rPr>
         <w:t xml:space="preserve">  </w:t>
       </w:r>
+      <w:proofErr w:type="gramStart"/>
       <w:r>
         <w:rPr>
           <w:b/>
@@ -1059,24 +1144,71 @@
           <w:sz w:val="17"/>
           <w:szCs w:val="17"/>
         </w:rPr>
+        <w:t>Hydrologie</w:t>
+      </w:r>
+      <w:r>
+        <w:rPr>
+          <w:color w:val="607080"/>
+          <w:sz w:val="17"/>
+          <w:szCs w:val="17"/>
+        </w:rPr>
+        <w:t xml:space="preserve">  ·</w:t>
+      </w:r>
+      <w:proofErr w:type="gramEnd"/>
+      <w:r>
+        <w:rPr>
+          <w:color w:val="607080"/>
+          <w:sz w:val="17"/>
+          <w:szCs w:val="17"/>
+        </w:rPr>
+        <w:t xml:space="preserve">  </w:t>
+      </w:r>
+      <w:r>
+        <w:rPr>
+          <w:b/>
+          <w:bCs/>
+          <w:color w:val="2E7D5E"/>
+          <w:sz w:val="17"/>
+          <w:szCs w:val="17"/>
+        </w:rPr>
         <w:t>Datenmanagement</w:t>
       </w:r>
     </w:p>
     <w:p>
       <w:pPr>
-        <w:pBdr>
-          <w:left w:val="single" w:sz="12" w:space="8" w:color="2E7D5E"/>
-        </w:pBdr>
-        <w:spacing w:before="80" w:after="20"/>
+        <w:spacing w:after="20"/>
         <w:ind w:left="200"/>
+        <w:rPr>
+          <w:color w:val="4A5A6A"/>
+          <w:sz w:val="19"/>
+          <w:szCs w:val="19"/>
+        </w:rPr>
       </w:pPr>
       <w:r>
         <w:rPr>
-          <w:b/>
-          <w:bCs/>
-          <w:color w:val="1E2D3D"/>
-        </w:rPr>
-        <w:t>Universelles Abflussmodell Tirol</w:t>
+          <w:color w:val="4A5A6A"/>
+          <w:sz w:val="19"/>
+          <w:szCs w:val="19"/>
+        </w:rPr>
+        <w:t xml:space="preserve">Entwicklung eines universellen Niederschlags-Abfluss-Modells für Tirol mittels </w:t>
+      </w:r>
+      <w:proofErr w:type="spellStart"/>
+      <w:r>
+        <w:rPr>
+          <w:color w:val="4A5A6A"/>
+          <w:sz w:val="19"/>
+          <w:szCs w:val="19"/>
+        </w:rPr>
+        <w:t>Machine</w:t>
+      </w:r>
+      <w:proofErr w:type="spellEnd"/>
+      <w:r>
+        <w:rPr>
+          <w:color w:val="4A5A6A"/>
+          <w:sz w:val="19"/>
+          <w:szCs w:val="19"/>
+        </w:rPr>
+        <w:t xml:space="preserve"> Learning.</w:t>
       </w:r>
     </w:p>
     <w:p>
@@ -1084,36 +1216,29 @@
         <w:spacing w:after="20"/>
         <w:ind w:left="200"/>
       </w:pPr>
-      <w:r>
-        <w:rPr>
-          <w:color w:val="4A5A6A"/>
-          <w:sz w:val="19"/>
-          <w:szCs w:val="19"/>
-        </w:rPr>
-        <w:t xml:space="preserve">Entwicklung eines universellen Niederschlags-Abfluss-Modells für Tirol mittels </w:t>
-      </w:r>
-      <w:proofErr w:type="spellStart"/>
-      <w:r>
-        <w:rPr>
-          <w:color w:val="4A5A6A"/>
-          <w:sz w:val="19"/>
-          <w:szCs w:val="19"/>
-        </w:rPr>
-        <w:t>Machine</w:t>
-      </w:r>
-      <w:proofErr w:type="spellEnd"/>
-      <w:r>
-        <w:rPr>
-          <w:color w:val="4A5A6A"/>
-          <w:sz w:val="19"/>
-          <w:szCs w:val="19"/>
-        </w:rPr>
-        <w:t xml:space="preserve"> Learning.</w:t>
-      </w:r>
     </w:p>
     <w:p>
       <w:pPr>
         <w:ind w:left="200"/>
+      </w:pPr>
+      <w:r>
+        <w:rPr>
+          <w:b/>
+          <w:bCs/>
+          <w:color w:val="1E2D3D"/>
+        </w:rPr>
+        <w:t>Permafrost Wärmefluss Modellierung</w:t>
+      </w:r>
+      <w:r>
+        <w:rPr>
+          <w:b/>
+          <w:bCs/>
+          <w:color w:val="1E2D3D"/>
+        </w:rPr>
+        <w:t xml:space="preserve"> </w:t>
+      </w:r>
+      <w:proofErr w:type="gramStart"/>
+      <w:r>
         <w:rPr>
           <w:b/>
           <w:bCs/>
@@ -1121,8 +1246,26 @@
           <w:sz w:val="17"/>
           <w:szCs w:val="17"/>
         </w:rPr>
-      </w:pPr>
-      <w:proofErr w:type="spellStart"/>
+        <w:t>Datenmanagement</w:t>
+      </w:r>
+      <w:r>
+        <w:rPr>
+          <w:color w:val="607080"/>
+          <w:sz w:val="17"/>
+          <w:szCs w:val="17"/>
+        </w:rPr>
+        <w:t xml:space="preserve">  ·</w:t>
+      </w:r>
+      <w:proofErr w:type="gramEnd"/>
+      <w:r>
+        <w:rPr>
+          <w:color w:val="607080"/>
+          <w:sz w:val="17"/>
+          <w:szCs w:val="17"/>
+        </w:rPr>
+        <w:t xml:space="preserve">  </w:t>
+      </w:r>
+      <w:proofErr w:type="gramStart"/>
       <w:r>
         <w:rPr>
           <w:b/>
@@ -1131,9 +1274,25 @@
           <w:sz w:val="17"/>
           <w:szCs w:val="17"/>
         </w:rPr>
-        <w:t>Machine</w:t>
-      </w:r>
-      <w:proofErr w:type="spellEnd"/>
+        <w:t>Klimaanpassung</w:t>
+      </w:r>
+      <w:r>
+        <w:rPr>
+          <w:color w:val="607080"/>
+          <w:sz w:val="17"/>
+          <w:szCs w:val="17"/>
+        </w:rPr>
+        <w:t xml:space="preserve">  ·</w:t>
+      </w:r>
+      <w:proofErr w:type="gramEnd"/>
+      <w:r>
+        <w:rPr>
+          <w:color w:val="607080"/>
+          <w:sz w:val="17"/>
+          <w:szCs w:val="17"/>
+        </w:rPr>
+        <w:t xml:space="preserve">  </w:t>
+      </w:r>
       <w:r>
         <w:rPr>
           <w:b/>
@@ -1142,223 +1301,18 @@
           <w:sz w:val="17"/>
           <w:szCs w:val="17"/>
         </w:rPr>
-        <w:t xml:space="preserve"> </w:t>
-      </w:r>
-      <w:proofErr w:type="gramStart"/>
-      <w:r>
-        <w:rPr>
-          <w:b/>
-          <w:bCs/>
-          <w:color w:val="2E7D5E"/>
-          <w:sz w:val="17"/>
-          <w:szCs w:val="17"/>
-        </w:rPr>
-        <w:t>Learning</w:t>
-      </w:r>
-      <w:r>
-        <w:rPr>
-          <w:color w:val="607080"/>
-          <w:sz w:val="17"/>
-          <w:szCs w:val="17"/>
-        </w:rPr>
-        <w:t xml:space="preserve">  </w:t>
-      </w:r>
-      <w:r>
-        <w:rPr>
-          <w:color w:val="607080"/>
-          <w:sz w:val="17"/>
-          <w:szCs w:val="17"/>
-        </w:rPr>
-        <w:t>·</w:t>
-      </w:r>
-      <w:proofErr w:type="gramEnd"/>
-      <w:r>
-        <w:rPr>
-          <w:color w:val="607080"/>
-          <w:sz w:val="17"/>
-          <w:szCs w:val="17"/>
-        </w:rPr>
-        <w:t xml:space="preserve">  </w:t>
-      </w:r>
-      <w:proofErr w:type="gramStart"/>
-      <w:r>
-        <w:rPr>
-          <w:b/>
-          <w:bCs/>
-          <w:color w:val="2E7D5E"/>
-          <w:sz w:val="17"/>
-          <w:szCs w:val="17"/>
-        </w:rPr>
-        <w:t>Hydrologie</w:t>
-      </w:r>
-      <w:r>
-        <w:rPr>
-          <w:color w:val="607080"/>
-          <w:sz w:val="17"/>
-          <w:szCs w:val="17"/>
-        </w:rPr>
-        <w:t xml:space="preserve">  ·</w:t>
-      </w:r>
-      <w:proofErr w:type="gramEnd"/>
-      <w:r>
-        <w:rPr>
-          <w:color w:val="607080"/>
-          <w:sz w:val="17"/>
-          <w:szCs w:val="17"/>
-        </w:rPr>
-        <w:t xml:space="preserve">  </w:t>
-      </w:r>
-      <w:r>
-        <w:rPr>
-          <w:b/>
-          <w:bCs/>
-          <w:color w:val="2E7D5E"/>
-          <w:sz w:val="17"/>
-          <w:szCs w:val="17"/>
-        </w:rPr>
-        <w:t>Datenmanagement</w:t>
-      </w:r>
-    </w:p>
-    <w:p>
-      <w:pPr>
-        <w:pBdr>
-          <w:left w:val="single" w:sz="12" w:space="8" w:color="2E7D5E"/>
-        </w:pBdr>
-        <w:spacing w:before="80" w:after="20"/>
-        <w:ind w:left="200"/>
-      </w:pPr>
-      <w:proofErr w:type="spellStart"/>
-      <w:r>
-        <w:rPr>
-          <w:b/>
-          <w:bCs/>
-          <w:color w:val="1E2D3D"/>
-        </w:rPr>
-        <w:t>Anergienetz</w:t>
-      </w:r>
-      <w:proofErr w:type="spellEnd"/>
-      <w:r>
-        <w:rPr>
-          <w:b/>
-          <w:bCs/>
-          <w:color w:val="1E2D3D"/>
-        </w:rPr>
-        <w:t xml:space="preserve"> Auffach / Wildschönau</w:t>
+        <w:t>Programmierung</w:t>
       </w:r>
     </w:p>
     <w:p>
       <w:pPr>
         <w:spacing w:after="20"/>
         <w:ind w:left="200"/>
-      </w:pPr>
-      <w:r>
         <w:rPr>
           <w:color w:val="4A5A6A"/>
           <w:sz w:val="19"/>
           <w:szCs w:val="19"/>
         </w:rPr>
-        <w:t>Machbarkeitsstudie für ein Niedertemperatur-Wärmenetz durch thermische Nutzung von Quellwasser.</w:t>
-      </w:r>
-    </w:p>
-    <w:p>
-      <w:pPr>
-        <w:ind w:left="200"/>
-        <w:rPr>
-          <w:b/>
-          <w:bCs/>
-          <w:color w:val="2E7D5E"/>
-          <w:sz w:val="17"/>
-          <w:szCs w:val="17"/>
-        </w:rPr>
-      </w:pPr>
-      <w:proofErr w:type="gramStart"/>
-      <w:r>
-        <w:rPr>
-          <w:b/>
-          <w:bCs/>
-          <w:color w:val="2E7D5E"/>
-          <w:sz w:val="17"/>
-          <w:szCs w:val="17"/>
-        </w:rPr>
-        <w:t>Energieraumplanung</w:t>
-      </w:r>
-      <w:r>
-        <w:rPr>
-          <w:color w:val="607080"/>
-          <w:sz w:val="17"/>
-          <w:szCs w:val="17"/>
-        </w:rPr>
-        <w:t xml:space="preserve">  ·</w:t>
-      </w:r>
-      <w:proofErr w:type="gramEnd"/>
-      <w:r>
-        <w:rPr>
-          <w:color w:val="607080"/>
-          <w:sz w:val="17"/>
-          <w:szCs w:val="17"/>
-        </w:rPr>
-        <w:t xml:space="preserve">  </w:t>
-      </w:r>
-      <w:proofErr w:type="gramStart"/>
-      <w:r>
-        <w:rPr>
-          <w:b/>
-          <w:bCs/>
-          <w:color w:val="2E7D5E"/>
-          <w:sz w:val="17"/>
-          <w:szCs w:val="17"/>
-        </w:rPr>
-        <w:t>Hydrogeologie</w:t>
-      </w:r>
-      <w:r>
-        <w:rPr>
-          <w:color w:val="607080"/>
-          <w:sz w:val="17"/>
-          <w:szCs w:val="17"/>
-        </w:rPr>
-        <w:t xml:space="preserve">  ·</w:t>
-      </w:r>
-      <w:proofErr w:type="gramEnd"/>
-      <w:r>
-        <w:rPr>
-          <w:color w:val="607080"/>
-          <w:sz w:val="17"/>
-          <w:szCs w:val="17"/>
-        </w:rPr>
-        <w:t xml:space="preserve">  </w:t>
-      </w:r>
-      <w:r>
-        <w:rPr>
-          <w:b/>
-          <w:bCs/>
-          <w:color w:val="2E7D5E"/>
-          <w:sz w:val="17"/>
-          <w:szCs w:val="17"/>
-        </w:rPr>
-        <w:t>Stakeholder-Management</w:t>
-      </w:r>
-    </w:p>
-    <w:p>
-      <w:pPr>
-        <w:pBdr>
-          <w:left w:val="single" w:sz="12" w:space="8" w:color="2E7D5E"/>
-        </w:pBdr>
-        <w:spacing w:before="80" w:after="20"/>
-        <w:ind w:left="200"/>
-      </w:pPr>
-      <w:r>
-        <w:rPr>
-          <w:b/>
-          <w:bCs/>
-          <w:color w:val="1E2D3D"/>
-        </w:rPr>
-        <w:t>Kommunale Energieversorgungskonzepte</w:t>
-      </w:r>
-    </w:p>
-    <w:p>
-      <w:pPr>
-        <w:spacing w:after="20"/>
-        <w:ind w:left="200"/>
       </w:pPr>
       <w:r>
         <w:rPr>
@@ -1366,113 +1320,15 @@
           <w:sz w:val="19"/>
           <w:szCs w:val="19"/>
         </w:rPr>
-        <w:t>Analyse von Energiebedarf und Ressourcenangebot für Gemeinden als Planungsgrundlage für kommunale Wärme- und Energieversorgung.</w:t>
-      </w:r>
-    </w:p>
-    <w:p>
-      <w:pPr>
-        <w:ind w:left="200"/>
-      </w:pPr>
-      <w:proofErr w:type="gramStart"/>
-      <w:r>
-        <w:rPr>
-          <w:b/>
-          <w:bCs/>
-          <w:color w:val="2E7D5E"/>
-          <w:sz w:val="17"/>
-          <w:szCs w:val="17"/>
-        </w:rPr>
-        <w:t>Energieraumplanung</w:t>
-      </w:r>
-      <w:r>
-        <w:rPr>
-          <w:color w:val="607080"/>
-          <w:sz w:val="17"/>
-          <w:szCs w:val="17"/>
-        </w:rPr>
-        <w:t xml:space="preserve">  ·</w:t>
-      </w:r>
-      <w:proofErr w:type="gramEnd"/>
-      <w:r>
-        <w:rPr>
-          <w:color w:val="607080"/>
-          <w:sz w:val="17"/>
-          <w:szCs w:val="17"/>
-        </w:rPr>
-        <w:t xml:space="preserve">  </w:t>
-      </w:r>
-      <w:proofErr w:type="gramStart"/>
-      <w:r>
-        <w:rPr>
-          <w:b/>
-          <w:bCs/>
-          <w:color w:val="2E7D5E"/>
-          <w:sz w:val="17"/>
-          <w:szCs w:val="17"/>
-        </w:rPr>
-        <w:t>GIS</w:t>
-      </w:r>
-      <w:r>
-        <w:rPr>
-          <w:color w:val="607080"/>
-          <w:sz w:val="17"/>
-          <w:szCs w:val="17"/>
-        </w:rPr>
-        <w:t xml:space="preserve">  ·</w:t>
-      </w:r>
-      <w:proofErr w:type="gramEnd"/>
-      <w:r>
-        <w:rPr>
-          <w:color w:val="607080"/>
-          <w:sz w:val="17"/>
-          <w:szCs w:val="17"/>
-        </w:rPr>
-        <w:t xml:space="preserve">  </w:t>
-      </w:r>
-      <w:r>
-        <w:rPr>
-          <w:b/>
-          <w:bCs/>
-          <w:color w:val="2E7D5E"/>
-          <w:sz w:val="17"/>
-          <w:szCs w:val="17"/>
-        </w:rPr>
-        <w:t>Datenmanagement</w:t>
-      </w:r>
-    </w:p>
-    <w:p>
-      <w:pPr>
-        <w:pBdr>
-          <w:left w:val="single" w:sz="12" w:space="8" w:color="2E7D5E"/>
-        </w:pBdr>
-        <w:spacing w:before="80" w:after="20"/>
-        <w:ind w:left="200"/>
-      </w:pPr>
-      <w:r>
-        <w:rPr>
-          <w:b/>
-          <w:bCs/>
-          <w:color w:val="1E2D3D"/>
-        </w:rPr>
-        <w:t>JAZ-Berechnungstool (Wärmepumpen)</w:t>
-      </w:r>
-    </w:p>
-    <w:p>
-      <w:pPr>
-        <w:ind w:left="200"/>
+        <w:t>Reduziertes Wärmefluss Modell zur Berechnung von Temperaturprofilen in Permafrostböden</w:t>
+      </w:r>
+      <w:r>
         <w:rPr>
           <w:color w:val="4A5A6A"/>
           <w:sz w:val="19"/>
           <w:szCs w:val="19"/>
         </w:rPr>
-      </w:pPr>
-      <w:r>
-        <w:rPr>
-          <w:color w:val="4A5A6A"/>
-          <w:sz w:val="19"/>
-          <w:szCs w:val="19"/>
-        </w:rPr>
-        <w:t xml:space="preserve">Web-Applikation zur Prognose der erwarteten Jahresarbeitszahl von Luft-Wärmepumpen nach Bin-Methode mit lokalen Klimadaten. </w:t>
+        <w:t xml:space="preserve">. </w:t>
       </w:r>
       <w:hyperlink r:id="rId9" w:history="1">
         <w:r>
@@ -1481,108 +1337,51 @@
             <w:sz w:val="19"/>
             <w:szCs w:val="19"/>
           </w:rPr>
-          <w:t xml:space="preserve">zum </w:t>
+          <w:t xml:space="preserve">Zum </w:t>
         </w:r>
-        <w:proofErr w:type="spellStart"/>
         <w:r>
           <w:rPr>
             <w:rStyle w:val="Hyperlink"/>
             <w:sz w:val="19"/>
             <w:szCs w:val="19"/>
           </w:rPr>
-          <w:t>tool</w:t>
+          <w:t>W</w:t>
         </w:r>
-        <w:proofErr w:type="spellEnd"/>
+        <w:r>
+          <w:rPr>
+            <w:rStyle w:val="Hyperlink"/>
+            <w:sz w:val="19"/>
+            <w:szCs w:val="19"/>
+          </w:rPr>
+          <w:t>eb</w:t>
+        </w:r>
+        <w:r>
+          <w:rPr>
+            <w:rStyle w:val="Hyperlink"/>
+            <w:sz w:val="19"/>
+            <w:szCs w:val="19"/>
+          </w:rPr>
+          <w:t>-T</w:t>
+        </w:r>
+        <w:r>
+          <w:rPr>
+            <w:rStyle w:val="Hyperlink"/>
+            <w:sz w:val="19"/>
+            <w:szCs w:val="19"/>
+          </w:rPr>
+          <w:t>ool</w:t>
+        </w:r>
       </w:hyperlink>
-      <w:r>
-        <w:rPr>
-          <w:color w:val="4A5A6A"/>
-          <w:sz w:val="19"/>
-          <w:szCs w:val="19"/>
-        </w:rPr>
-        <w:t xml:space="preserve"> </w:t>
-      </w:r>
-    </w:p>
-    <w:p>
-      <w:pPr>
-        <w:ind w:left="200"/>
-      </w:pPr>
-      <w:proofErr w:type="gramStart"/>
-      <w:r>
-        <w:rPr>
-          <w:b/>
-          <w:bCs/>
-          <w:color w:val="2E7D5E"/>
-          <w:sz w:val="17"/>
-          <w:szCs w:val="17"/>
-        </w:rPr>
-        <w:t>Programmierung</w:t>
-      </w:r>
-      <w:r>
-        <w:rPr>
-          <w:color w:val="607080"/>
-          <w:sz w:val="17"/>
-          <w:szCs w:val="17"/>
-        </w:rPr>
-        <w:t xml:space="preserve">  ·</w:t>
-      </w:r>
-      <w:proofErr w:type="gramEnd"/>
-      <w:r>
-        <w:rPr>
-          <w:color w:val="607080"/>
-          <w:sz w:val="17"/>
-          <w:szCs w:val="17"/>
-        </w:rPr>
-        <w:t xml:space="preserve">  </w:t>
-      </w:r>
-      <w:r>
-        <w:rPr>
-          <w:b/>
-          <w:bCs/>
-          <w:color w:val="2E7D5E"/>
-          <w:sz w:val="17"/>
-          <w:szCs w:val="17"/>
-        </w:rPr>
-        <w:t>Klimadaten</w:t>
-      </w:r>
-    </w:p>
-    <w:p>
-      <w:pPr>
-        <w:pBdr>
-          <w:left w:val="single" w:sz="12" w:space="8" w:color="2E7D5E"/>
-        </w:pBdr>
-        <w:spacing w:before="80" w:after="20"/>
-        <w:ind w:left="200"/>
-      </w:pPr>
-      <w:r>
-        <w:rPr>
-          <w:b/>
-          <w:bCs/>
-          <w:color w:val="1E2D3D"/>
-        </w:rPr>
-        <w:t>Wasserkraftpotenzial Reutte</w:t>
-      </w:r>
     </w:p>
     <w:p>
       <w:pPr>
         <w:spacing w:after="20"/>
         <w:ind w:left="200"/>
       </w:pPr>
-      <w:r>
-        <w:rPr>
-          <w:color w:val="4A5A6A"/>
-          <w:sz w:val="19"/>
-          <w:szCs w:val="19"/>
-        </w:rPr>
-        <w:t>Potenzialstudie für Wasserkraftnutzung im gesamten Bezirk Reutte.</w:t>
-      </w:r>
     </w:p>
     <w:p>
       <w:pPr>
         <w:ind w:left="200"/>
-      </w:pPr>
-      <w:proofErr w:type="gramStart"/>
-      <w:r>
         <w:rPr>
           <w:b/>
           <w:bCs/>
@@ -1590,24 +1389,32 @@
           <w:sz w:val="17"/>
           <w:szCs w:val="17"/>
         </w:rPr>
-        <w:t>Wasserkraft</w:t>
-      </w:r>
-      <w:r>
-        <w:rPr>
-          <w:color w:val="607080"/>
-          <w:sz w:val="17"/>
-          <w:szCs w:val="17"/>
-        </w:rPr>
-        <w:t xml:space="preserve">  ·</w:t>
-      </w:r>
-      <w:proofErr w:type="gramEnd"/>
-      <w:r>
-        <w:rPr>
-          <w:color w:val="607080"/>
-          <w:sz w:val="17"/>
-          <w:szCs w:val="17"/>
-        </w:rPr>
-        <w:t xml:space="preserve">  </w:t>
+      </w:pPr>
+      <w:r>
+        <w:rPr>
+          <w:b/>
+          <w:bCs/>
+          <w:color w:val="1E2D3D"/>
+        </w:rPr>
+        <w:t xml:space="preserve">Mount </w:t>
+      </w:r>
+      <w:proofErr w:type="spellStart"/>
+      <w:r>
+        <w:rPr>
+          <w:b/>
+          <w:bCs/>
+          <w:color w:val="1E2D3D"/>
+        </w:rPr>
+        <w:t>Resilience</w:t>
+      </w:r>
+      <w:proofErr w:type="spellEnd"/>
+      <w:r>
+        <w:rPr>
+          <w:b/>
+          <w:bCs/>
+          <w:color w:val="1E2D3D"/>
+        </w:rPr>
+        <w:t xml:space="preserve"> </w:t>
       </w:r>
       <w:proofErr w:type="gramStart"/>
       <w:r>
@@ -1618,7 +1425,7 @@
           <w:sz w:val="17"/>
           <w:szCs w:val="17"/>
         </w:rPr>
-        <w:t>Programmierung</w:t>
+        <w:t>Datenmanagement</w:t>
       </w:r>
       <w:r>
         <w:rPr>
@@ -1637,6 +1444,7 @@
         </w:rPr>
         <w:t xml:space="preserve">  </w:t>
       </w:r>
+      <w:proofErr w:type="gramStart"/>
       <w:r>
         <w:rPr>
           <w:b/>
@@ -1645,48 +1453,173 @@
           <w:sz w:val="17"/>
           <w:szCs w:val="17"/>
         </w:rPr>
-        <w:t>GIS</w:t>
+        <w:t>Klimaanpassung</w:t>
+      </w:r>
+      <w:r>
+        <w:rPr>
+          <w:color w:val="607080"/>
+          <w:sz w:val="17"/>
+          <w:szCs w:val="17"/>
+        </w:rPr>
+        <w:t xml:space="preserve">  ·</w:t>
+      </w:r>
+      <w:proofErr w:type="gramEnd"/>
+      <w:r>
+        <w:rPr>
+          <w:color w:val="607080"/>
+          <w:sz w:val="17"/>
+          <w:szCs w:val="17"/>
+        </w:rPr>
+        <w:t xml:space="preserve">  </w:t>
+      </w:r>
+      <w:r>
+        <w:rPr>
+          <w:b/>
+          <w:bCs/>
+          <w:color w:val="2E7D5E"/>
+          <w:sz w:val="17"/>
+          <w:szCs w:val="17"/>
+        </w:rPr>
+        <w:t>Programmierung</w:t>
       </w:r>
     </w:p>
     <w:p>
       <w:pPr>
-        <w:pBdr>
-          <w:left w:val="single" w:sz="12" w:space="8" w:color="2E7D5E"/>
-        </w:pBdr>
-        <w:spacing w:before="80" w:after="20"/>
+        <w:spacing w:after="20"/>
         <w:ind w:left="200"/>
+        <w:rPr>
+          <w:color w:val="4A5A6A"/>
+          <w:sz w:val="19"/>
+          <w:szCs w:val="19"/>
+        </w:rPr>
       </w:pPr>
       <w:r>
         <w:rPr>
-          <w:b/>
-          <w:bCs/>
-          <w:color w:val="1E2D3D"/>
-        </w:rPr>
-        <w:t xml:space="preserve">Mount </w:t>
-      </w:r>
-      <w:proofErr w:type="spellStart"/>
-      <w:r>
-        <w:rPr>
-          <w:b/>
-          <w:bCs/>
-          <w:color w:val="1E2D3D"/>
-        </w:rPr>
-        <w:t>Resilience</w:t>
-      </w:r>
-      <w:proofErr w:type="spellEnd"/>
+          <w:color w:val="4A5A6A"/>
+          <w:sz w:val="19"/>
+          <w:szCs w:val="19"/>
+        </w:rPr>
+        <w:t>EU-Projekt zur Klimawandelanpassung in Bergregionen. Analyse von Klimadaten auf Gemeindeebene und Entwicklung eines Online-Tools für Gemeinden.</w:t>
+      </w:r>
     </w:p>
     <w:p>
       <w:pPr>
         <w:spacing w:after="20"/>
         <w:ind w:left="200"/>
       </w:pPr>
-      <w:r>
+    </w:p>
+    <w:p>
+      <w:pPr>
+        <w:ind w:left="200"/>
+      </w:pPr>
+      <w:r>
+        <w:rPr>
+          <w:b/>
+          <w:bCs/>
+          <w:color w:val="1E2D3D"/>
+        </w:rPr>
+        <w:t>Gletscherrekonstruktion Stubaier Alpen</w:t>
+      </w:r>
+      <w:r>
+        <w:rPr>
+          <w:b/>
+          <w:bCs/>
+          <w:color w:val="1E2D3D"/>
+        </w:rPr>
+        <w:t xml:space="preserve"> </w:t>
+      </w:r>
+      <w:proofErr w:type="gramStart"/>
+      <w:r>
+        <w:rPr>
+          <w:b/>
+          <w:bCs/>
+          <w:color w:val="2E7D5E"/>
+          <w:sz w:val="17"/>
+          <w:szCs w:val="17"/>
+        </w:rPr>
+        <w:t>GIS</w:t>
+      </w:r>
+      <w:r>
+        <w:rPr>
+          <w:color w:val="607080"/>
+          <w:sz w:val="17"/>
+          <w:szCs w:val="17"/>
+        </w:rPr>
+        <w:t xml:space="preserve">  ·</w:t>
+      </w:r>
+      <w:proofErr w:type="gramEnd"/>
+      <w:r>
+        <w:rPr>
+          <w:color w:val="607080"/>
+          <w:sz w:val="17"/>
+          <w:szCs w:val="17"/>
+        </w:rPr>
+        <w:t xml:space="preserve">  </w:t>
+      </w:r>
+      <w:r>
+        <w:rPr>
+          <w:b/>
+          <w:bCs/>
+          <w:color w:val="2E7D5E"/>
+          <w:sz w:val="17"/>
+          <w:szCs w:val="17"/>
+        </w:rPr>
+        <w:t>Programmierung</w:t>
+      </w:r>
+      <w:r>
+        <w:rPr>
+          <w:color w:val="607080"/>
+          <w:sz w:val="17"/>
+          <w:szCs w:val="17"/>
+        </w:rPr>
+        <w:t xml:space="preserve"> </w:t>
+      </w:r>
+      <w:proofErr w:type="gramStart"/>
+      <w:r>
+        <w:rPr>
+          <w:color w:val="607080"/>
+          <w:sz w:val="17"/>
+          <w:szCs w:val="17"/>
+        </w:rPr>
+        <w:t xml:space="preserve">·  </w:t>
+      </w:r>
+      <w:r>
+        <w:rPr>
+          <w:b/>
+          <w:bCs/>
+          <w:color w:val="2E7D5E"/>
+          <w:sz w:val="17"/>
+          <w:szCs w:val="17"/>
+        </w:rPr>
+        <w:t>Gletscher</w:t>
+      </w:r>
+      <w:proofErr w:type="gramEnd"/>
+    </w:p>
+    <w:p>
+      <w:pPr>
+        <w:spacing w:after="20"/>
+        <w:ind w:left="200"/>
         <w:rPr>
           <w:color w:val="4A5A6A"/>
           <w:sz w:val="19"/>
           <w:szCs w:val="19"/>
         </w:rPr>
-        <w:t xml:space="preserve">EU-Projekt zur Klimawandelanpassung in Bergregionen. Analyse von Klimadaten auf Gemeindeebene und Entwicklung eines Online-Tools für Gemeinden. </w:t>
+      </w:pPr>
+      <w:r>
+        <w:rPr>
+          <w:color w:val="4A5A6A"/>
+          <w:sz w:val="19"/>
+          <w:szCs w:val="19"/>
+        </w:rPr>
+        <w:t>Web Tool zur Visualisierung der Gletscherstände während der Kleinen Eiszeit in den Stubaier Alpen.</w:t>
+      </w:r>
+      <w:r>
+        <w:rPr>
+          <w:color w:val="4A5A6A"/>
+          <w:sz w:val="19"/>
+          <w:szCs w:val="19"/>
+        </w:rPr>
+        <w:t xml:space="preserve"> </w:t>
       </w:r>
       <w:hyperlink r:id="rId10" w:history="1">
         <w:r>
@@ -1695,89 +1628,395 @@
             <w:sz w:val="19"/>
             <w:szCs w:val="19"/>
           </w:rPr>
-          <w:t xml:space="preserve">zum </w:t>
+          <w:t>Zum Web-Tool</w:t>
         </w:r>
-        <w:proofErr w:type="spellStart"/>
+      </w:hyperlink>
+    </w:p>
+    <w:p>
+      <w:pPr>
+        <w:spacing w:after="20"/>
+        <w:ind w:left="200"/>
+        <w:rPr>
+          <w:color w:val="4A5A6A"/>
+          <w:sz w:val="19"/>
+          <w:szCs w:val="19"/>
+        </w:rPr>
+      </w:pPr>
+    </w:p>
+    <w:p>
+      <w:pPr>
+        <w:ind w:left="200"/>
+        <w:rPr>
+          <w:b/>
+          <w:bCs/>
+          <w:color w:val="2E7D5E"/>
+          <w:sz w:val="17"/>
+          <w:szCs w:val="17"/>
+        </w:rPr>
+      </w:pPr>
+      <w:proofErr w:type="spellStart"/>
+      <w:r>
+        <w:rPr>
+          <w:b/>
+          <w:bCs/>
+          <w:color w:val="1E2D3D"/>
+        </w:rPr>
+        <w:t>Anergienetz</w:t>
+      </w:r>
+      <w:proofErr w:type="spellEnd"/>
+      <w:r>
+        <w:rPr>
+          <w:b/>
+          <w:bCs/>
+          <w:color w:val="1E2D3D"/>
+        </w:rPr>
+        <w:t xml:space="preserve"> Auffach / Wildschönau</w:t>
+      </w:r>
+      <w:r>
+        <w:rPr>
+          <w:b/>
+          <w:bCs/>
+          <w:color w:val="1E2D3D"/>
+        </w:rPr>
+        <w:t xml:space="preserve"> </w:t>
+      </w:r>
+      <w:proofErr w:type="gramStart"/>
+      <w:r>
+        <w:rPr>
+          <w:b/>
+          <w:bCs/>
+          <w:color w:val="2E7D5E"/>
+          <w:sz w:val="17"/>
+          <w:szCs w:val="17"/>
+        </w:rPr>
+        <w:t>Energieraumplanung</w:t>
+      </w:r>
+      <w:r>
+        <w:rPr>
+          <w:color w:val="607080"/>
+          <w:sz w:val="17"/>
+          <w:szCs w:val="17"/>
+        </w:rPr>
+        <w:t xml:space="preserve">  ·</w:t>
+      </w:r>
+      <w:proofErr w:type="gramEnd"/>
+      <w:r>
+        <w:rPr>
+          <w:color w:val="607080"/>
+          <w:sz w:val="17"/>
+          <w:szCs w:val="17"/>
+        </w:rPr>
+        <w:t xml:space="preserve">  </w:t>
+      </w:r>
+      <w:proofErr w:type="gramStart"/>
+      <w:r>
+        <w:rPr>
+          <w:b/>
+          <w:bCs/>
+          <w:color w:val="2E7D5E"/>
+          <w:sz w:val="17"/>
+          <w:szCs w:val="17"/>
+        </w:rPr>
+        <w:t>Hydrogeologie</w:t>
+      </w:r>
+      <w:r>
+        <w:rPr>
+          <w:color w:val="607080"/>
+          <w:sz w:val="17"/>
+          <w:szCs w:val="17"/>
+        </w:rPr>
+        <w:t xml:space="preserve">  ·</w:t>
+      </w:r>
+      <w:proofErr w:type="gramEnd"/>
+      <w:r>
+        <w:rPr>
+          <w:color w:val="607080"/>
+          <w:sz w:val="17"/>
+          <w:szCs w:val="17"/>
+        </w:rPr>
+        <w:t xml:space="preserve">  </w:t>
+      </w:r>
+      <w:r>
+        <w:rPr>
+          <w:b/>
+          <w:bCs/>
+          <w:color w:val="2E7D5E"/>
+          <w:sz w:val="17"/>
+          <w:szCs w:val="17"/>
+        </w:rPr>
+        <w:t>Stakeholder-Management</w:t>
+      </w:r>
+    </w:p>
+    <w:p>
+      <w:pPr>
+        <w:spacing w:after="20"/>
+        <w:ind w:left="200"/>
+        <w:rPr>
+          <w:color w:val="4A5A6A"/>
+          <w:sz w:val="19"/>
+          <w:szCs w:val="19"/>
+        </w:rPr>
+      </w:pPr>
+      <w:r>
+        <w:rPr>
+          <w:color w:val="4A5A6A"/>
+          <w:sz w:val="19"/>
+          <w:szCs w:val="19"/>
+        </w:rPr>
+        <w:t>Machbarkeitsstudie für ein Niedertemperatur-Wärmenetz durch thermische Nutzung von Quellwasser.</w:t>
+      </w:r>
+    </w:p>
+    <w:p>
+      <w:pPr>
+        <w:spacing w:after="20"/>
+        <w:ind w:left="200"/>
+      </w:pPr>
+    </w:p>
+    <w:p>
+      <w:pPr>
+        <w:ind w:left="200"/>
+      </w:pPr>
+      <w:r>
+        <w:rPr>
+          <w:b/>
+          <w:bCs/>
+          <w:color w:val="1E2D3D"/>
+        </w:rPr>
+        <w:t>Kommunale Energieversorgungskonzepte</w:t>
+      </w:r>
+      <w:r>
+        <w:rPr>
+          <w:b/>
+          <w:bCs/>
+          <w:color w:val="1E2D3D"/>
+        </w:rPr>
+        <w:t xml:space="preserve"> </w:t>
+      </w:r>
+      <w:proofErr w:type="gramStart"/>
+      <w:r>
+        <w:rPr>
+          <w:b/>
+          <w:bCs/>
+          <w:color w:val="2E7D5E"/>
+          <w:sz w:val="17"/>
+          <w:szCs w:val="17"/>
+        </w:rPr>
+        <w:t>Energieraumplanung</w:t>
+      </w:r>
+      <w:r>
+        <w:rPr>
+          <w:color w:val="607080"/>
+          <w:sz w:val="17"/>
+          <w:szCs w:val="17"/>
+        </w:rPr>
+        <w:t xml:space="preserve">  ·</w:t>
+      </w:r>
+      <w:proofErr w:type="gramEnd"/>
+      <w:r>
+        <w:rPr>
+          <w:color w:val="607080"/>
+          <w:sz w:val="17"/>
+          <w:szCs w:val="17"/>
+        </w:rPr>
+        <w:t xml:space="preserve">  </w:t>
+      </w:r>
+      <w:proofErr w:type="gramStart"/>
+      <w:r>
+        <w:rPr>
+          <w:b/>
+          <w:bCs/>
+          <w:color w:val="2E7D5E"/>
+          <w:sz w:val="17"/>
+          <w:szCs w:val="17"/>
+        </w:rPr>
+        <w:t>GIS</w:t>
+      </w:r>
+      <w:r>
+        <w:rPr>
+          <w:color w:val="607080"/>
+          <w:sz w:val="17"/>
+          <w:szCs w:val="17"/>
+        </w:rPr>
+        <w:t xml:space="preserve">  ·</w:t>
+      </w:r>
+      <w:proofErr w:type="gramEnd"/>
+      <w:r>
+        <w:rPr>
+          <w:color w:val="607080"/>
+          <w:sz w:val="17"/>
+          <w:szCs w:val="17"/>
+        </w:rPr>
+        <w:t xml:space="preserve">  </w:t>
+      </w:r>
+      <w:r>
+        <w:rPr>
+          <w:b/>
+          <w:bCs/>
+          <w:color w:val="2E7D5E"/>
+          <w:sz w:val="17"/>
+          <w:szCs w:val="17"/>
+        </w:rPr>
+        <w:t>Datenmanagement</w:t>
+      </w:r>
+    </w:p>
+    <w:p>
+      <w:pPr>
+        <w:spacing w:after="20"/>
+        <w:ind w:left="200"/>
+        <w:rPr>
+          <w:color w:val="4A5A6A"/>
+          <w:sz w:val="19"/>
+          <w:szCs w:val="19"/>
+        </w:rPr>
+      </w:pPr>
+      <w:r>
+        <w:rPr>
+          <w:color w:val="4A5A6A"/>
+          <w:sz w:val="19"/>
+          <w:szCs w:val="19"/>
+        </w:rPr>
+        <w:t>Analyse von Energiebedarf und Ressourcenangebot für Gemeinden als Planungsgrundlage für kommunale Wärme- und Energieversorgung.</w:t>
+      </w:r>
+    </w:p>
+    <w:p>
+      <w:pPr>
+        <w:spacing w:after="20"/>
+        <w:ind w:left="200"/>
+      </w:pPr>
+    </w:p>
+    <w:p>
+      <w:pPr>
+        <w:ind w:left="200"/>
+      </w:pPr>
+      <w:r>
+        <w:rPr>
+          <w:b/>
+          <w:bCs/>
+          <w:color w:val="1E2D3D"/>
+        </w:rPr>
+        <w:t>JAZ-Berechnungstool (Wärmepumpen)</w:t>
+      </w:r>
+      <w:r>
+        <w:rPr>
+          <w:b/>
+          <w:bCs/>
+          <w:color w:val="1E2D3D"/>
+        </w:rPr>
+        <w:t xml:space="preserve"> </w:t>
+      </w:r>
+      <w:proofErr w:type="gramStart"/>
+      <w:r>
+        <w:rPr>
+          <w:b/>
+          <w:bCs/>
+          <w:color w:val="2E7D5E"/>
+          <w:sz w:val="17"/>
+          <w:szCs w:val="17"/>
+        </w:rPr>
+        <w:t>Programmierung</w:t>
+      </w:r>
+      <w:r>
+        <w:rPr>
+          <w:color w:val="607080"/>
+          <w:sz w:val="17"/>
+          <w:szCs w:val="17"/>
+        </w:rPr>
+        <w:t xml:space="preserve">  ·</w:t>
+      </w:r>
+      <w:proofErr w:type="gramEnd"/>
+      <w:r>
+        <w:rPr>
+          <w:color w:val="607080"/>
+          <w:sz w:val="17"/>
+          <w:szCs w:val="17"/>
+        </w:rPr>
+        <w:t xml:space="preserve">  </w:t>
+      </w:r>
+      <w:r>
+        <w:rPr>
+          <w:b/>
+          <w:bCs/>
+          <w:color w:val="2E7D5E"/>
+          <w:sz w:val="17"/>
+          <w:szCs w:val="17"/>
+        </w:rPr>
+        <w:t>Klimadaten</w:t>
+      </w:r>
+    </w:p>
+    <w:p>
+      <w:pPr>
+        <w:ind w:left="200"/>
+        <w:rPr>
+          <w:color w:val="4A5A6A"/>
+          <w:sz w:val="19"/>
+          <w:szCs w:val="19"/>
+        </w:rPr>
+      </w:pPr>
+      <w:r>
+        <w:rPr>
+          <w:color w:val="4A5A6A"/>
+          <w:sz w:val="19"/>
+          <w:szCs w:val="19"/>
+        </w:rPr>
+        <w:t xml:space="preserve">Web-Applikation zur Prognose der erwarteten Jahresarbeitszahl von Luft-Wärmepumpen nach Bin-Methode mit lokalen Klimadaten. </w:t>
+      </w:r>
+      <w:hyperlink r:id="rId11" w:history="1">
         <w:r>
           <w:rPr>
             <w:rStyle w:val="Hyperlink"/>
             <w:sz w:val="19"/>
             <w:szCs w:val="19"/>
           </w:rPr>
-          <w:t>tool</w:t>
+          <w:t>Z</w:t>
         </w:r>
-        <w:proofErr w:type="spellEnd"/>
+        <w:r>
+          <w:rPr>
+            <w:rStyle w:val="Hyperlink"/>
+            <w:sz w:val="19"/>
+            <w:szCs w:val="19"/>
+          </w:rPr>
+          <w:t xml:space="preserve">um </w:t>
+        </w:r>
+        <w:r>
+          <w:rPr>
+            <w:rStyle w:val="Hyperlink"/>
+            <w:sz w:val="19"/>
+            <w:szCs w:val="19"/>
+          </w:rPr>
+          <w:t>We</w:t>
+        </w:r>
+        <w:r>
+          <w:rPr>
+            <w:rStyle w:val="Hyperlink"/>
+            <w:sz w:val="19"/>
+            <w:szCs w:val="19"/>
+          </w:rPr>
+          <w:t>b</w:t>
+        </w:r>
+        <w:r>
+          <w:rPr>
+            <w:rStyle w:val="Hyperlink"/>
+            <w:sz w:val="19"/>
+            <w:szCs w:val="19"/>
+          </w:rPr>
+          <w:t>-T</w:t>
+        </w:r>
+        <w:r>
+          <w:rPr>
+            <w:rStyle w:val="Hyperlink"/>
+            <w:sz w:val="19"/>
+            <w:szCs w:val="19"/>
+          </w:rPr>
+          <w:t>ool</w:t>
+        </w:r>
       </w:hyperlink>
-    </w:p>
-    <w:p>
-      <w:pPr>
-        <w:ind w:left="200"/>
-      </w:pPr>
-      <w:proofErr w:type="gramStart"/>
-      <w:r>
-        <w:rPr>
-          <w:b/>
-          <w:bCs/>
-          <w:color w:val="2E7D5E"/>
-          <w:sz w:val="17"/>
-          <w:szCs w:val="17"/>
-        </w:rPr>
-        <w:t>Datenmanagement</w:t>
-      </w:r>
-      <w:r>
-        <w:rPr>
-          <w:color w:val="607080"/>
-          <w:sz w:val="17"/>
-          <w:szCs w:val="17"/>
-        </w:rPr>
-        <w:t xml:space="preserve">  ·</w:t>
-      </w:r>
-      <w:proofErr w:type="gramEnd"/>
-      <w:r>
-        <w:rPr>
-          <w:color w:val="607080"/>
-          <w:sz w:val="17"/>
-          <w:szCs w:val="17"/>
-        </w:rPr>
-        <w:t xml:space="preserve">  </w:t>
-      </w:r>
-      <w:proofErr w:type="gramStart"/>
-      <w:r>
-        <w:rPr>
-          <w:b/>
-          <w:bCs/>
-          <w:color w:val="2E7D5E"/>
-          <w:sz w:val="17"/>
-          <w:szCs w:val="17"/>
-        </w:rPr>
-        <w:t>Klimaanpassung</w:t>
-      </w:r>
-      <w:r>
-        <w:rPr>
-          <w:color w:val="607080"/>
-          <w:sz w:val="17"/>
-          <w:szCs w:val="17"/>
-        </w:rPr>
-        <w:t xml:space="preserve">  ·</w:t>
-      </w:r>
-      <w:proofErr w:type="gramEnd"/>
-      <w:r>
-        <w:rPr>
-          <w:color w:val="607080"/>
-          <w:sz w:val="17"/>
-          <w:szCs w:val="17"/>
-        </w:rPr>
-        <w:t xml:space="preserve">  </w:t>
-      </w:r>
-      <w:r>
-        <w:rPr>
-          <w:b/>
-          <w:bCs/>
-          <w:color w:val="2E7D5E"/>
-          <w:sz w:val="17"/>
-          <w:szCs w:val="17"/>
-        </w:rPr>
-        <w:t>Programmierung</w:t>
+      <w:r>
+        <w:rPr>
+          <w:color w:val="4A5A6A"/>
+          <w:sz w:val="19"/>
+          <w:szCs w:val="19"/>
+        </w:rPr>
+        <w:t xml:space="preserve"> </w:t>
       </w:r>
     </w:p>
     <w:p>
@@ -3994,7 +4233,27 @@
                 <w:sz w:val="17"/>
                 <w:szCs w:val="17"/>
               </w:rPr>
-              <w:t>OFFICE &amp; VISUALISIERUNG</w:t>
+              <w:t xml:space="preserve">OFFICE &amp; </w:t>
+            </w:r>
+            <w:r>
+              <w:rPr>
+                <w:b/>
+                <w:bCs/>
+                <w:color w:val="2E7D5E"/>
+                <w:sz w:val="17"/>
+                <w:szCs w:val="17"/>
+              </w:rPr>
+              <w:t>G</w:t>
+            </w:r>
+            <w:r>
+              <w:rPr>
+                <w:b/>
+                <w:bCs/>
+                <w:color w:val="2E7D5E"/>
+                <w:sz w:val="17"/>
+                <w:szCs w:val="17"/>
+              </w:rPr>
+              <w:t>RAFIK</w:t>
             </w:r>
           </w:p>
         </w:tc>
@@ -4028,25 +4287,7 @@
                 <w:szCs w:val="19"/>
                 <w:lang w:val="en-GB"/>
               </w:rPr>
-              <w:t>MS Office (</w:t>
-            </w:r>
-            <w:proofErr w:type="spellStart"/>
-            <w:r>
-              <w:rPr>
-                <w:sz w:val="19"/>
-                <w:szCs w:val="19"/>
-                <w:lang w:val="en-GB"/>
-              </w:rPr>
-              <w:t>inkl</w:t>
-            </w:r>
-            <w:proofErr w:type="spellEnd"/>
-            <w:r>
-              <w:rPr>
-                <w:sz w:val="19"/>
-                <w:szCs w:val="19"/>
-                <w:lang w:val="en-GB"/>
-              </w:rPr>
-              <w:t>. Excel, Power Query)</w:t>
+              <w:t>MS Office</w:t>
             </w:r>
           </w:p>
         </w:tc>
@@ -5352,7 +5593,7 @@
         </w:rPr>
         <w:t xml:space="preserve"> 20, 2024. </w:t>
       </w:r>
-      <w:hyperlink r:id="rId11" w:history="1">
+      <w:hyperlink r:id="rId12" w:history="1">
         <w:r>
           <w:rPr>
             <w:color w:val="2E7D5E"/>
@@ -5410,7 +5651,7 @@
         </w:rPr>
         <w:t xml:space="preserve"> 4, 2022. </w:t>
       </w:r>
-      <w:hyperlink r:id="rId12" w:history="1">
+      <w:hyperlink r:id="rId13" w:history="1">
         <w:r>
           <w:rPr>
             <w:color w:val="2E7D5E"/>
@@ -5456,7 +5697,7 @@
         </w:rPr>
         <w:t xml:space="preserve"> 11, 2020. </w:t>
       </w:r>
-      <w:hyperlink r:id="rId13" w:history="1">
+      <w:hyperlink r:id="rId14" w:history="1">
         <w:r>
           <w:rPr>
             <w:color w:val="2E7D5E"/>
@@ -5541,7 +5782,7 @@
         </w:rPr>
         <w:t xml:space="preserve"> 31, 2017. </w:t>
       </w:r>
-      <w:hyperlink r:id="rId14" w:history="1">
+      <w:hyperlink r:id="rId15" w:history="1">
         <w:r>
           <w:rPr>
             <w:color w:val="2E7D5E"/>
@@ -5598,7 +5839,7 @@
         </w:rPr>
         <w:t xml:space="preserve"> 670, 2026. </w:t>
       </w:r>
-      <w:hyperlink r:id="rId15" w:history="1">
+      <w:hyperlink r:id="rId16" w:history="1">
         <w:proofErr w:type="gramStart"/>
         <w:r>
           <w:rPr>
@@ -5691,7 +5932,7 @@
         </w:rPr>
         <w:t xml:space="preserve"> 19, 2023. </w:t>
       </w:r>
-      <w:hyperlink r:id="rId16" w:history="1">
+      <w:hyperlink r:id="rId17" w:history="1">
         <w:r>
           <w:rPr>
             <w:color w:val="2E7D5E"/>
@@ -5757,7 +5998,7 @@
         </w:rPr>
         <w:t xml:space="preserve"> 8, 2018. </w:t>
       </w:r>
-      <w:hyperlink r:id="rId17" w:history="1">
+      <w:hyperlink r:id="rId18" w:history="1">
         <w:r>
           <w:rPr>
             <w:color w:val="2E7D5E"/>
@@ -5875,7 +6116,7 @@
         </w:rPr>
         <w:t xml:space="preserve"> 151, 2020. </w:t>
       </w:r>
-      <w:hyperlink r:id="rId18" w:history="1">
+      <w:hyperlink r:id="rId19" w:history="1">
         <w:proofErr w:type="gramStart"/>
         <w:r>
           <w:rPr>
@@ -5906,7 +6147,7 @@
         </w:rPr>
         <w:t xml:space="preserve">Vollständige Publikationsliste: </w:t>
       </w:r>
-      <w:hyperlink r:id="rId19" w:history="1">
+      <w:hyperlink r:id="rId20" w:history="1">
         <w:r>
           <w:rPr>
             <w:rStyle w:val="Hyperlink"/>
@@ -5924,7 +6165,7 @@
         </w:rPr>
         <w:t xml:space="preserve">  ·  </w:t>
       </w:r>
-      <w:hyperlink r:id="rId20" w:history="1">
+      <w:hyperlink r:id="rId21" w:history="1">
         <w:proofErr w:type="spellStart"/>
         <w:r>
           <w:rPr>
@@ -6080,8 +6321,8 @@
       </w:pPr>
     </w:p>
     <w:sectPr>
-      <w:headerReference w:type="default" r:id="rId21"/>
-      <w:footerReference w:type="default" r:id="rId22"/>
+      <w:headerReference w:type="default" r:id="rId22"/>
+      <w:footerReference w:type="default" r:id="rId23"/>
       <w:pgSz w:w="11906" w:h="16838"/>
       <w:pgMar w:top="1020" w:right="1020" w:bottom="1020" w:left="1020" w:header="708" w:footer="708" w:gutter="0"/>
       <w:cols w:space="720"/>
@@ -6119,6 +6360,11 @@
       </w:pBdr>
       <w:spacing w:before="80"/>
       <w:jc w:val="center"/>
+      <w:rPr>
+        <w:color w:val="607080"/>
+        <w:sz w:val="16"/>
+        <w:szCs w:val="16"/>
+      </w:rPr>
     </w:pPr>
     <w:r>
       <w:rPr>
@@ -6208,6 +6454,22 @@
         <w:t>paultoechterle.at</w:t>
       </w:r>
     </w:hyperlink>
+    <w:r>
+      <w:rPr>
+        <w:color w:val="607080"/>
+        <w:sz w:val="18"/>
+        <w:szCs w:val="18"/>
+      </w:rPr>
+      <w:t xml:space="preserve">  ·  </w:t>
+    </w:r>
+    <w:r>
+      <w:rPr>
+        <w:color w:val="607080"/>
+        <w:sz w:val="16"/>
+        <w:szCs w:val="16"/>
+      </w:rPr>
+      <w:t>+43 650 571 40 68</w:t>
+    </w:r>
   </w:p>
   <w:p>
     <w:pPr>
@@ -6861,6 +7123,7 @@
   <w:style w:type="paragraph" w:default="1" w:styleId="Standard">
     <w:name w:val="Normal"/>
     <w:qFormat/>
+    <w:rsid w:val="0055536E"/>
   </w:style>
   <w:style w:type="paragraph" w:styleId="berschrift1">
     <w:name w:val="heading 1"/>
@@ -6949,7 +7212,6 @@
   <w:style w:type="character" w:default="1" w:styleId="Absatz-Standardschriftart">
     <w:name w:val="Default Paragraph Font"/>
     <w:uiPriority w:val="1"/>
-    <w:semiHidden/>
     <w:unhideWhenUsed/>
   </w:style>
   <w:style w:type="table" w:default="1" w:styleId="NormaleTabelle">

</xml_diff>